<commit_message>
polynomial addition using linked list
</commit_message>
<xml_diff>
--- a/DSA Notes.docx
+++ b/DSA Notes.docx
@@ -13758,6 +13758,1182 @@
       </w:r>
     </w:p>
     <w:p/>
+    <w:p>
+      <w:pPr>
+        <w:rPr>
+          <w:b/>
+          <w:bCs/>
+        </w:rPr>
+      </w:pPr>
+      <w:r>
+        <w:rPr>
+          <w:b/>
+          <w:bCs/>
+        </w:rPr>
+        <w:t>Example Implementation of LinkedList:</w:t>
+      </w:r>
+    </w:p>
+    <w:p>
+      <w:r>
+        <w:t>package linkedlist.practice;</w:t>
+      </w:r>
+    </w:p>
+    <w:p/>
+    <w:p>
+      <w:r>
+        <w:t>/**</w:t>
+      </w:r>
+    </w:p>
+    <w:p>
+      <w:r>
+        <w:t> * Node class representing a single term in the polynomial.</w:t>
+      </w:r>
+    </w:p>
+    <w:p>
+      <w:r>
+        <w:t> * e.g., 3x^2 is represented by a node with coef = 3, expo = 2.</w:t>
+      </w:r>
+    </w:p>
+    <w:p>
+      <w:r>
+        <w:t> */</w:t>
+      </w:r>
+    </w:p>
+    <w:p>
+      <w:r>
+        <w:lastRenderedPageBreak/>
+        <w:t>class Node {</w:t>
+      </w:r>
+    </w:p>
+    <w:p>
+      <w:r>
+        <w:t>    int coef;  // Coefficient of the term</w:t>
+      </w:r>
+    </w:p>
+    <w:p>
+      <w:r>
+        <w:t>    int expo;  // Exponent (power) of the term</w:t>
+      </w:r>
+    </w:p>
+    <w:p>
+      <w:r>
+        <w:t>    Node next; // Reference to the next term in the polynomial</w:t>
+      </w:r>
+    </w:p>
+    <w:p/>
+    <w:p>
+      <w:r>
+        <w:t>    public Node(int coef, int expo) {</w:t>
+      </w:r>
+    </w:p>
+    <w:p>
+      <w:r>
+        <w:t>        this.coef = coef;</w:t>
+      </w:r>
+    </w:p>
+    <w:p>
+      <w:r>
+        <w:t>        this.expo = expo;</w:t>
+      </w:r>
+    </w:p>
+    <w:p>
+      <w:r>
+        <w:t>        this.next = null;</w:t>
+      </w:r>
+    </w:p>
+    <w:p>
+      <w:r>
+        <w:t>    }</w:t>
+      </w:r>
+    </w:p>
+    <w:p>
+      <w:r>
+        <w:t>}</w:t>
+      </w:r>
+    </w:p>
+    <w:p/>
+    <w:p>
+      <w:r>
+        <w:t>/**</w:t>
+      </w:r>
+    </w:p>
+    <w:p>
+      <w:r>
+        <w:t> * Singly Linked List acting as the ADT for our Polynomial.</w:t>
+      </w:r>
+    </w:p>
+    <w:p>
+      <w:r>
+        <w:t> */</w:t>
+      </w:r>
+    </w:p>
+    <w:p>
+      <w:r>
+        <w:t>class LinkedList {</w:t>
+      </w:r>
+    </w:p>
+    <w:p>
+      <w:r>
+        <w:t>    public Node head = null;</w:t>
+      </w:r>
+    </w:p>
+    <w:p/>
+    <w:p>
+      <w:r>
+        <w:t>    // Insert at the beginning: O(1) Time</w:t>
+      </w:r>
+    </w:p>
+    <w:p>
+      <w:r>
+        <w:t>    public void insertFirst(int coef, int expo) {</w:t>
+      </w:r>
+    </w:p>
+    <w:p>
+      <w:r>
+        <w:t>        Node newNode = new Node(coef, expo);</w:t>
+      </w:r>
+    </w:p>
+    <w:p>
+      <w:r>
+        <w:t>        newNode.next = head;</w:t>
+      </w:r>
+    </w:p>
+    <w:p>
+      <w:r>
+        <w:t>        head = newNode;</w:t>
+      </w:r>
+    </w:p>
+    <w:p>
+      <w:r>
+        <w:t>    }</w:t>
+      </w:r>
+    </w:p>
+    <w:p/>
+    <w:p>
+      <w:r>
+        <w:t>    // Insert at the end: O(n) Time</w:t>
+      </w:r>
+    </w:p>
+    <w:p>
+      <w:r>
+        <w:t>    // Note: If this were optimized with a tail pointer, it would be O(1)!</w:t>
+      </w:r>
+    </w:p>
+    <w:p>
+      <w:r>
+        <w:t>    public void insertLast(int coef, int expo) {</w:t>
+      </w:r>
+    </w:p>
+    <w:p>
+      <w:r>
+        <w:t>        // Skip zero coefficients to keep the polynomial clean</w:t>
+      </w:r>
+    </w:p>
+    <w:p>
+      <w:r>
+        <w:t>        if (coef == 0) return;</w:t>
+      </w:r>
+    </w:p>
+    <w:p/>
+    <w:p>
+      <w:r>
+        <w:lastRenderedPageBreak/>
+        <w:t>        if (head == null) {</w:t>
+      </w:r>
+    </w:p>
+    <w:p>
+      <w:r>
+        <w:t>            insertFirst(coef, expo);</w:t>
+      </w:r>
+    </w:p>
+    <w:p>
+      <w:r>
+        <w:t>            return;</w:t>
+      </w:r>
+    </w:p>
+    <w:p>
+      <w:r>
+        <w:t>        }</w:t>
+      </w:r>
+    </w:p>
+    <w:p/>
+    <w:p>
+      <w:r>
+        <w:t>        Node newNode = new Node(coef, expo);</w:t>
+      </w:r>
+    </w:p>
+    <w:p>
+      <w:r>
+        <w:t>        Node temp = head;</w:t>
+      </w:r>
+    </w:p>
+    <w:p>
+      <w:r>
+        <w:t>        while (temp.next != null) {</w:t>
+      </w:r>
+    </w:p>
+    <w:p>
+      <w:r>
+        <w:t>            temp = temp.next;</w:t>
+      </w:r>
+    </w:p>
+    <w:p>
+      <w:r>
+        <w:t>        }</w:t>
+      </w:r>
+    </w:p>
+    <w:p>
+      <w:r>
+        <w:t>        temp.next = newNode;</w:t>
+      </w:r>
+    </w:p>
+    <w:p>
+      <w:r>
+        <w:t>    }</w:t>
+      </w:r>
+    </w:p>
+    <w:p/>
+    <w:p>
+      <w:r>
+        <w:t>    // Display the polynomial in a mathematically beautiful form: O(n) Time</w:t>
+      </w:r>
+    </w:p>
+    <w:p>
+      <w:r>
+        <w:t>    public void display() {</w:t>
+      </w:r>
+    </w:p>
+    <w:p>
+      <w:r>
+        <w:t>        if (head == null) {</w:t>
+      </w:r>
+    </w:p>
+    <w:p>
+      <w:r>
+        <w:t>            System.out.println("0");</w:t>
+      </w:r>
+    </w:p>
+    <w:p>
+      <w:r>
+        <w:t>            return;</w:t>
+      </w:r>
+    </w:p>
+    <w:p>
+      <w:r>
+        <w:t>        }</w:t>
+      </w:r>
+    </w:p>
+    <w:p/>
+    <w:p>
+      <w:r>
+        <w:t>        Node temp = head;</w:t>
+      </w:r>
+    </w:p>
+    <w:p>
+      <w:r>
+        <w:t>        boolean isFirst = true;</w:t>
+      </w:r>
+    </w:p>
+    <w:p/>
+    <w:p>
+      <w:r>
+        <w:t>        while (temp != null) {</w:t>
+      </w:r>
+    </w:p>
+    <w:p>
+      <w:r>
+        <w:t>            int c = temp.coef;</w:t>
+      </w:r>
+    </w:p>
+    <w:p>
+      <w:r>
+        <w:t>            int e = temp.expo;</w:t>
+      </w:r>
+    </w:p>
+    <w:p/>
+    <w:p>
+      <w:r>
+        <w:t>            // Handle the sign elegantly for positive and negative terms</w:t>
+      </w:r>
+    </w:p>
+    <w:p>
+      <w:r>
+        <w:t>            if (c &gt; 0 &amp;&amp; !isFirst) {</w:t>
+      </w:r>
+    </w:p>
+    <w:p>
+      <w:r>
+        <w:t>                System.out.print(" + ");</w:t>
+      </w:r>
+    </w:p>
+    <w:p>
+      <w:r>
+        <w:t>            } else if (c &lt; 0) {</w:t>
+      </w:r>
+    </w:p>
+    <w:p>
+      <w:r>
+        <w:lastRenderedPageBreak/>
+        <w:t>                System.out.print(isFirst ? "-" : " - ");</w:t>
+      </w:r>
+    </w:p>
+    <w:p>
+      <w:r>
+        <w:t>                c = -c; // Work with positive value for easier printing</w:t>
+      </w:r>
+    </w:p>
+    <w:p>
+      <w:r>
+        <w:t>            }</w:t>
+      </w:r>
+    </w:p>
+    <w:p/>
+    <w:p>
+      <w:r>
+        <w:t>            // Print Coefficient</w:t>
+      </w:r>
+    </w:p>
+    <w:p>
+      <w:r>
+        <w:t>            if (c != 1 || e == 0) {</w:t>
+      </w:r>
+    </w:p>
+    <w:p>
+      <w:r>
+        <w:t>                System.out.print(c);</w:t>
+      </w:r>
+    </w:p>
+    <w:p>
+      <w:r>
+        <w:t>            }</w:t>
+      </w:r>
+    </w:p>
+    <w:p/>
+    <w:p>
+      <w:r>
+        <w:t>            // Print Exponent</w:t>
+      </w:r>
+    </w:p>
+    <w:p>
+      <w:r>
+        <w:t>            if (e == 1) {</w:t>
+      </w:r>
+    </w:p>
+    <w:p>
+      <w:r>
+        <w:t>                System.out.print("x");</w:t>
+      </w:r>
+    </w:p>
+    <w:p>
+      <w:r>
+        <w:t>            } else if (e != 0) {</w:t>
+      </w:r>
+    </w:p>
+    <w:p>
+      <w:r>
+        <w:t>                System.out.print("x^" + e);</w:t>
+      </w:r>
+    </w:p>
+    <w:p>
+      <w:r>
+        <w:t>            }</w:t>
+      </w:r>
+    </w:p>
+    <w:p/>
+    <w:p>
+      <w:r>
+        <w:t>            isFirst = false;</w:t>
+      </w:r>
+    </w:p>
+    <w:p>
+      <w:r>
+        <w:t>            temp = temp.next;</w:t>
+      </w:r>
+    </w:p>
+    <w:p>
+      <w:r>
+        <w:t>        }</w:t>
+      </w:r>
+    </w:p>
+    <w:p>
+      <w:r>
+        <w:t>        System.out.println();</w:t>
+      </w:r>
+    </w:p>
+    <w:p>
+      <w:r>
+        <w:t>    }</w:t>
+      </w:r>
+    </w:p>
+    <w:p>
+      <w:r>
+        <w:t>}</w:t>
+      </w:r>
+    </w:p>
+    <w:p/>
+    <w:p>
+      <w:r>
+        <w:t>public class PolynomialAddition {</w:t>
+      </w:r>
+    </w:p>
+    <w:p/>
+    <w:p>
+      <w:r>
+        <w:t>    /**</w:t>
+      </w:r>
+    </w:p>
+    <w:p>
+      <w:r>
+        <w:t>     * Adds two polynomials represented as linked lists.</w:t>
+      </w:r>
+    </w:p>
+    <w:p>
+      <w:r>
+        <w:t>     * This uses a Two-Pointer technique on both lists simultaneously.</w:t>
+      </w:r>
+    </w:p>
+    <w:p>
+      <w:r>
+        <w:t>     * * Time Complexity: O(m + n) where m and n are the number of terms.</w:t>
+      </w:r>
+    </w:p>
+    <w:p>
+      <w:r>
+        <w:t>     * Space Complexity: O(m + n) to store the sum in a new linked list.</w:t>
+      </w:r>
+    </w:p>
+    <w:p>
+      <w:r>
+        <w:t>     * * @param p1 Head of the first polynomial list</w:t>
+      </w:r>
+    </w:p>
+    <w:p>
+      <w:r>
+        <w:lastRenderedPageBreak/>
+        <w:t>     * @param p2 Head of the second polynomial list</w:t>
+      </w:r>
+    </w:p>
+    <w:p>
+      <w:r>
+        <w:t>     * @return A new LinkedList containing the sum</w:t>
+      </w:r>
+    </w:p>
+    <w:p>
+      <w:r>
+        <w:t>     */</w:t>
+      </w:r>
+    </w:p>
+    <w:p>
+      <w:r>
+        <w:t>    public static LinkedList addPolynomial(Node p1, Node p2) {</w:t>
+      </w:r>
+    </w:p>
+    <w:p>
+      <w:r>
+        <w:t>        LinkedList result = new LinkedList();</w:t>
+      </w:r>
+    </w:p>
+    <w:p>
+      <w:r>
+        <w:t xml:space="preserve">        </w:t>
+      </w:r>
+    </w:p>
+    <w:p>
+      <w:r>
+        <w:t>        // Traverse both polynomials until we reach the end of one</w:t>
+      </w:r>
+    </w:p>
+    <w:p>
+      <w:r>
+        <w:t>        while (p1 != null &amp;&amp; p2 != null) {</w:t>
+      </w:r>
+    </w:p>
+    <w:p>
+      <w:r>
+        <w:t>            if (p1.expo == p2.expo) {</w:t>
+      </w:r>
+    </w:p>
+    <w:p>
+      <w:r>
+        <w:t>                // If exponents match, add coefficients and advance both pointers</w:t>
+      </w:r>
+    </w:p>
+    <w:p>
+      <w:r>
+        <w:t>                int sumCoef = p1.coef + p2.coef;</w:t>
+      </w:r>
+    </w:p>
+    <w:p>
+      <w:r>
+        <w:t>                result.insertLast(sumCoef, p1.expo);</w:t>
+      </w:r>
+    </w:p>
+    <w:p>
+      <w:r>
+        <w:t>                p1 = p1.next;</w:t>
+      </w:r>
+    </w:p>
+    <w:p>
+      <w:r>
+        <w:t>                p2 = p2.next;</w:t>
+      </w:r>
+    </w:p>
+    <w:p>
+      <w:r>
+        <w:t>            } else if (p1.expo &gt; p2.expo) {</w:t>
+      </w:r>
+    </w:p>
+    <w:p>
+      <w:r>
+        <w:t>                // If p1's exponent is larger, copy p1's term and advance p1 pointer</w:t>
+      </w:r>
+    </w:p>
+    <w:p>
+      <w:r>
+        <w:t>                result.insertLast(p1.coef, p1.expo);</w:t>
+      </w:r>
+    </w:p>
+    <w:p>
+      <w:r>
+        <w:t>                p1 = p1.next;</w:t>
+      </w:r>
+    </w:p>
+    <w:p>
+      <w:r>
+        <w:t>            } else {</w:t>
+      </w:r>
+    </w:p>
+    <w:p>
+      <w:r>
+        <w:t>                // EXAM BUG FIXED: Changed p2.coef in the second parameter to p2.expo</w:t>
+      </w:r>
+    </w:p>
+    <w:p>
+      <w:r>
+        <w:t>                // If p2's exponent is larger, copy p2's term and advance p2 pointer</w:t>
+      </w:r>
+    </w:p>
+    <w:p>
+      <w:r>
+        <w:t>                result.insertLast(p2.coef, p2.expo);</w:t>
+      </w:r>
+    </w:p>
+    <w:p>
+      <w:r>
+        <w:t>                p2 = p2.next;</w:t>
+      </w:r>
+    </w:p>
+    <w:p>
+      <w:r>
+        <w:t>            }</w:t>
+      </w:r>
+    </w:p>
+    <w:p>
+      <w:r>
+        <w:t>        }</w:t>
+      </w:r>
+    </w:p>
+    <w:p/>
+    <w:p>
+      <w:r>
+        <w:t>        // Copy any remaining terms from the first polynomial</w:t>
+      </w:r>
+    </w:p>
+    <w:p>
+      <w:r>
+        <w:t>        while (p1 != null) {</w:t>
+      </w:r>
+    </w:p>
+    <w:p>
+      <w:r>
+        <w:t>            result.insertLast(p1.coef, p1.expo);</w:t>
+      </w:r>
+    </w:p>
+    <w:p>
+      <w:r>
+        <w:t>            p1 = p1.next;</w:t>
+      </w:r>
+    </w:p>
+    <w:p>
+      <w:r>
+        <w:t>        }</w:t>
+      </w:r>
+    </w:p>
+    <w:p/>
+    <w:p>
+      <w:r>
+        <w:t>        // Copy any remaining terms from the second polynomial</w:t>
+      </w:r>
+    </w:p>
+    <w:p>
+      <w:r>
+        <w:t>        while (p2 != null) {</w:t>
+      </w:r>
+    </w:p>
+    <w:p>
+      <w:r>
+        <w:t>            result.insertLast(p2.coef, p2.expo);</w:t>
+      </w:r>
+    </w:p>
+    <w:p>
+      <w:r>
+        <w:t>            p2 = p2.next;</w:t>
+      </w:r>
+    </w:p>
+    <w:p>
+      <w:r>
+        <w:t>        }</w:t>
+      </w:r>
+    </w:p>
+    <w:p/>
+    <w:p>
+      <w:r>
+        <w:t>        return result;</w:t>
+      </w:r>
+    </w:p>
+    <w:p>
+      <w:r>
+        <w:t>    }</w:t>
+      </w:r>
+    </w:p>
+    <w:p/>
+    <w:p>
+      <w:r>
+        <w:t>    public static void main(String[] args) {</w:t>
+      </w:r>
+    </w:p>
+    <w:p>
+      <w:r>
+        <w:t>        System.out.println("=== POLYNOMIAL ADDITION USING LINKED LISTS ===");</w:t>
+      </w:r>
+    </w:p>
+    <w:p/>
+    <w:p>
+      <w:r>
+        <w:t>        // Representing: 3x^2 + 4x + 1</w:t>
+      </w:r>
+    </w:p>
+    <w:p>
+      <w:r>
+        <w:t>        LinkedList p1 = new LinkedList();</w:t>
+      </w:r>
+    </w:p>
+    <w:p>
+      <w:r>
+        <w:t>        p1.insertLast(3, 2);</w:t>
+      </w:r>
+    </w:p>
+    <w:p>
+      <w:r>
+        <w:t>        p1.insertLast(4, 1);</w:t>
+      </w:r>
+    </w:p>
+    <w:p>
+      <w:r>
+        <w:t>        p1.insertLast(1, 0);</w:t>
+      </w:r>
+    </w:p>
+    <w:p/>
+    <w:p>
+      <w:r>
+        <w:t>        System.out.print("P1: ");</w:t>
+      </w:r>
+    </w:p>
+    <w:p>
+      <w:r>
+        <w:t>        p1.display();</w:t>
+      </w:r>
+    </w:p>
+    <w:p/>
+    <w:p>
+      <w:r>
+        <w:t>        // Representing: 4x^2 - 2x  (Testing negative coefficients too!)</w:t>
+      </w:r>
+    </w:p>
+    <w:p>
+      <w:r>
+        <w:t>        LinkedList p2 = new LinkedList();</w:t>
+      </w:r>
+    </w:p>
+    <w:p>
+      <w:r>
+        <w:t>        p2.insertLast(4, 2);</w:t>
+      </w:r>
+    </w:p>
+    <w:p>
+      <w:r>
+        <w:t>        p2.insertLast(-2, 1);</w:t>
+      </w:r>
+    </w:p>
+    <w:p/>
+    <w:p>
+      <w:r>
+        <w:t>        System.out.print("P2: ");</w:t>
+      </w:r>
+    </w:p>
+    <w:p>
+      <w:r>
+        <w:t>        p2.display();</w:t>
+      </w:r>
+    </w:p>
+    <w:p/>
+    <w:p>
+      <w:r>
+        <w:t>        // Add both polynomials together (clean functional pattern, no global static variable)</w:t>
+      </w:r>
+    </w:p>
+    <w:p>
+      <w:r>
+        <w:lastRenderedPageBreak/>
+        <w:t>        LinkedList sum = addPolynomial(p1.head, p2.head);</w:t>
+      </w:r>
+    </w:p>
+    <w:p/>
+    <w:p>
+      <w:r>
+        <w:t>        System.out.print("Sum: ");</w:t>
+      </w:r>
+    </w:p>
+    <w:p>
+      <w:r>
+        <w:t>        sum.display(); // Expected Output: 7x^2 + 2x + 1</w:t>
+      </w:r>
+    </w:p>
+    <w:p>
+      <w:r>
+        <w:t>    }</w:t>
+      </w:r>
+    </w:p>
+    <w:p>
+      <w:r>
+        <w:t>}</w:t>
+      </w:r>
+    </w:p>
+    <w:p>
+      <w:pPr>
+        <w:rPr>
+          <w:b/>
+          <w:bCs/>
+        </w:rPr>
+      </w:pPr>
+      <w:r>
+        <w:rPr>
+          <w:b/>
+          <w:bCs/>
+        </w:rPr>
+        <w:t>How this Algorithm Works Under the Hood</w:t>
+      </w:r>
+    </w:p>
+    <w:p>
+      <w:r>
+        <w:t xml:space="preserve">This problem is a stellar real-world implementation of </w:t>
+      </w:r>
+      <w:r>
+        <w:rPr>
+          <w:b/>
+          <w:bCs/>
+        </w:rPr>
+        <w:t>Two Pointers applied to Linked Lists</w:t>
+      </w:r>
+      <w:r>
+        <w:t>. It behaves identically to the merge phase of Merge Sort.</w:t>
+      </w:r>
+    </w:p>
+    <w:p>
+      <w:r>
+        <w:t>Since polynomials are kept in descending order of their exponents, we can compare the heads of both lists at each step:</w:t>
+      </w:r>
+    </w:p>
+    <w:p>
+      <w:pPr>
+        <w:numPr>
+          <w:ilvl w:val="0"/>
+          <w:numId w:val="61"/>
+        </w:numPr>
+      </w:pPr>
+      <w:r>
+        <w:rPr>
+          <w:b/>
+          <w:bCs/>
+        </w:rPr>
+        <w:t>Exponents are Equal (p1.expo == p2.expo):</w:t>
+      </w:r>
+    </w:p>
+    <w:p>
+      <w:pPr>
+        <w:numPr>
+          <w:ilvl w:val="1"/>
+          <w:numId w:val="61"/>
+        </w:numPr>
+      </w:pPr>
+      <w:r>
+        <w:t xml:space="preserve">Mathematically, we can add their coefficients directly (e.g., </w:t>
+      </w:r>
+      <m:oMath>
+        <m:r>
+          <w:rPr>
+            <w:rFonts w:ascii="Cambria Math" w:hAnsi="Cambria Math"/>
+          </w:rPr>
+          <m:t>3</m:t>
+        </m:r>
+        <m:sSup>
+          <m:sSupPr>
+            <m:ctrlPr>
+              <w:rPr>
+                <w:rFonts w:ascii="Cambria Math" w:hAnsi="Cambria Math"/>
+              </w:rPr>
+            </m:ctrlPr>
+          </m:sSupPr>
+          <m:e>
+            <m:r>
+              <w:rPr>
+                <w:rFonts w:ascii="Cambria Math" w:hAnsi="Cambria Math"/>
+              </w:rPr>
+              <m:t>x</m:t>
+            </m:r>
+          </m:e>
+          <m:sup>
+            <m:r>
+              <w:rPr>
+                <w:rFonts w:ascii="Cambria Math" w:hAnsi="Cambria Math"/>
+              </w:rPr>
+              <m:t>2</m:t>
+            </m:r>
+          </m:sup>
+        </m:sSup>
+        <m:r>
+          <w:rPr>
+            <w:rFonts w:ascii="Cambria Math" w:hAnsi="Cambria Math"/>
+          </w:rPr>
+          <m:t>+4</m:t>
+        </m:r>
+        <m:sSup>
+          <m:sSupPr>
+            <m:ctrlPr>
+              <w:rPr>
+                <w:rFonts w:ascii="Cambria Math" w:hAnsi="Cambria Math"/>
+              </w:rPr>
+            </m:ctrlPr>
+          </m:sSupPr>
+          <m:e>
+            <m:r>
+              <w:rPr>
+                <w:rFonts w:ascii="Cambria Math" w:hAnsi="Cambria Math"/>
+              </w:rPr>
+              <m:t>x</m:t>
+            </m:r>
+          </m:e>
+          <m:sup>
+            <m:r>
+              <w:rPr>
+                <w:rFonts w:ascii="Cambria Math" w:hAnsi="Cambria Math"/>
+              </w:rPr>
+              <m:t>2</m:t>
+            </m:r>
+          </m:sup>
+        </m:sSup>
+        <m:r>
+          <w:rPr>
+            <w:rFonts w:ascii="Cambria Math" w:hAnsi="Cambria Math"/>
+          </w:rPr>
+          <m:t>=7</m:t>
+        </m:r>
+        <m:sSup>
+          <m:sSupPr>
+            <m:ctrlPr>
+              <w:rPr>
+                <w:rFonts w:ascii="Cambria Math" w:hAnsi="Cambria Math"/>
+              </w:rPr>
+            </m:ctrlPr>
+          </m:sSupPr>
+          <m:e>
+            <m:r>
+              <w:rPr>
+                <w:rFonts w:ascii="Cambria Math" w:hAnsi="Cambria Math"/>
+              </w:rPr>
+              <m:t>x</m:t>
+            </m:r>
+          </m:e>
+          <m:sup>
+            <m:r>
+              <w:rPr>
+                <w:rFonts w:ascii="Cambria Math" w:hAnsi="Cambria Math"/>
+              </w:rPr>
+              <m:t>2</m:t>
+            </m:r>
+          </m:sup>
+        </m:sSup>
+      </m:oMath>
+      <w:r>
+        <w:t>).</w:t>
+      </w:r>
+    </w:p>
+    <w:p>
+      <w:pPr>
+        <w:numPr>
+          <w:ilvl w:val="1"/>
+          <w:numId w:val="61"/>
+        </w:numPr>
+      </w:pPr>
+      <w:r>
+        <w:t xml:space="preserve">We insert the sum into our output list and advance </w:t>
+      </w:r>
+      <w:r>
+        <w:rPr>
+          <w:i/>
+          <w:iCs/>
+        </w:rPr>
+        <w:t>both</w:t>
+      </w:r>
+      <w:r>
+        <w:t xml:space="preserve"> p1 and p2 pointers.</w:t>
+      </w:r>
+    </w:p>
+    <w:p>
+      <w:pPr>
+        <w:numPr>
+          <w:ilvl w:val="0"/>
+          <w:numId w:val="61"/>
+        </w:numPr>
+      </w:pPr>
+      <w:r>
+        <w:rPr>
+          <w:b/>
+          <w:bCs/>
+        </w:rPr>
+        <w:t>Exponents are Unequal (p1.expo &gt; p2.expo or vice versa):</w:t>
+      </w:r>
+    </w:p>
+    <w:p>
+      <w:pPr>
+        <w:numPr>
+          <w:ilvl w:val="1"/>
+          <w:numId w:val="61"/>
+        </w:numPr>
+      </w:pPr>
+      <w:r>
+        <w:t xml:space="preserve">We cannot combine these terms (e.g., </w:t>
+      </w:r>
+      <m:oMath>
+        <m:r>
+          <w:rPr>
+            <w:rFonts w:ascii="Cambria Math" w:hAnsi="Cambria Math"/>
+          </w:rPr>
+          <m:t>3</m:t>
+        </m:r>
+        <m:sSup>
+          <m:sSupPr>
+            <m:ctrlPr>
+              <w:rPr>
+                <w:rFonts w:ascii="Cambria Math" w:hAnsi="Cambria Math"/>
+              </w:rPr>
+            </m:ctrlPr>
+          </m:sSupPr>
+          <m:e>
+            <m:r>
+              <w:rPr>
+                <w:rFonts w:ascii="Cambria Math" w:hAnsi="Cambria Math"/>
+              </w:rPr>
+              <m:t>x</m:t>
+            </m:r>
+          </m:e>
+          <m:sup>
+            <m:r>
+              <w:rPr>
+                <w:rFonts w:ascii="Cambria Math" w:hAnsi="Cambria Math"/>
+              </w:rPr>
+              <m:t>3</m:t>
+            </m:r>
+          </m:sup>
+        </m:sSup>
+      </m:oMath>
+      <w:r>
+        <w:t xml:space="preserve"> and </w:t>
+      </w:r>
+      <m:oMath>
+        <m:r>
+          <w:rPr>
+            <w:rFonts w:ascii="Cambria Math" w:hAnsi="Cambria Math"/>
+          </w:rPr>
+          <m:t>4</m:t>
+        </m:r>
+        <m:sSup>
+          <m:sSupPr>
+            <m:ctrlPr>
+              <w:rPr>
+                <w:rFonts w:ascii="Cambria Math" w:hAnsi="Cambria Math"/>
+              </w:rPr>
+            </m:ctrlPr>
+          </m:sSupPr>
+          <m:e>
+            <m:r>
+              <w:rPr>
+                <w:rFonts w:ascii="Cambria Math" w:hAnsi="Cambria Math"/>
+              </w:rPr>
+              <m:t>x</m:t>
+            </m:r>
+          </m:e>
+          <m:sup>
+            <m:r>
+              <w:rPr>
+                <w:rFonts w:ascii="Cambria Math" w:hAnsi="Cambria Math"/>
+              </w:rPr>
+              <m:t>2</m:t>
+            </m:r>
+          </m:sup>
+        </m:sSup>
+      </m:oMath>
+      <w:r>
+        <w:t>).</w:t>
+      </w:r>
+    </w:p>
+    <w:p>
+      <w:pPr>
+        <w:numPr>
+          <w:ilvl w:val="1"/>
+          <w:numId w:val="61"/>
+        </w:numPr>
+      </w:pPr>
+      <w:r>
+        <w:t>The term with the larger exponent is copied directly to our output list to maintain descending order, and we advance only that pointer.</w:t>
+      </w:r>
+    </w:p>
+    <w:p>
+      <w:pPr>
+        <w:numPr>
+          <w:ilvl w:val="0"/>
+          <w:numId w:val="61"/>
+        </w:numPr>
+      </w:pPr>
+      <w:r>
+        <w:rPr>
+          <w:b/>
+          <w:bCs/>
+        </w:rPr>
+        <w:t>Exhaustion Loop:</w:t>
+      </w:r>
+    </w:p>
+    <w:p>
+      <w:pPr>
+        <w:numPr>
+          <w:ilvl w:val="1"/>
+          <w:numId w:val="61"/>
+        </w:numPr>
+      </w:pPr>
+      <w:r>
+        <w:t>Once one list is fully traversed, any remaining elements in the other list are simply appended to the end of the sum list (since they have smaller exponents than any terms we processed).</w:t>
+      </w:r>
+    </w:p>
+    <w:p>
+      <w:pPr>
+        <w:rPr>
+          <w:b/>
+          <w:bCs/>
+        </w:rPr>
+      </w:pPr>
+      <w:r>
+        <w:rPr>
+          <w:b/>
+          <w:bCs/>
+        </w:rPr>
+        <w:t>Time &amp; Space Complexity (A Favorite Exam Question)</w:t>
+      </w:r>
+    </w:p>
+    <w:p>
+      <w:pPr>
+        <w:numPr>
+          <w:ilvl w:val="0"/>
+          <w:numId w:val="62"/>
+        </w:numPr>
+      </w:pPr>
+      <w:r>
+        <w:rPr>
+          <w:b/>
+          <w:bCs/>
+        </w:rPr>
+        <w:t xml:space="preserve">Time Complexity: </w:t>
+      </w:r>
+      <m:oMath>
+        <m:r>
+          <m:rPr>
+            <m:sty m:val="p"/>
+          </m:rPr>
+          <w:rPr>
+            <w:rFonts w:ascii="Cambria Math" w:hAnsi="Cambria Math"/>
+          </w:rPr>
+          <m:t>Θ</m:t>
+        </m:r>
+        <m:d>
+          <m:dPr>
+            <m:ctrlPr>
+              <w:rPr>
+                <w:rFonts w:ascii="Cambria Math" w:hAnsi="Cambria Math"/>
+              </w:rPr>
+            </m:ctrlPr>
+          </m:dPr>
+          <m:e>
+            <m:r>
+              <w:rPr>
+                <w:rFonts w:ascii="Cambria Math" w:hAnsi="Cambria Math"/>
+              </w:rPr>
+              <m:t>m+n</m:t>
+            </m:r>
+          </m:e>
+        </m:d>
+      </m:oMath>
+      <w:r>
+        <w:t xml:space="preserve"> — We only make a single pass through both lists simultaneously. At every iteration of our loop, we advance at least one pointer. Thus, the total iterations are bounded directly by the total number of terms.</w:t>
+      </w:r>
+    </w:p>
+    <w:p>
+      <w:pPr>
+        <w:numPr>
+          <w:ilvl w:val="0"/>
+          <w:numId w:val="62"/>
+        </w:numPr>
+      </w:pPr>
+      <w:r>
+        <w:rPr>
+          <w:b/>
+          <w:bCs/>
+        </w:rPr>
+        <w:t xml:space="preserve">Space Complexity: </w:t>
+      </w:r>
+      <m:oMath>
+        <m:r>
+          <w:rPr>
+            <w:rFonts w:ascii="Cambria Math" w:hAnsi="Cambria Math"/>
+          </w:rPr>
+          <m:t>O</m:t>
+        </m:r>
+        <m:d>
+          <m:dPr>
+            <m:ctrlPr>
+              <w:rPr>
+                <w:rFonts w:ascii="Cambria Math" w:hAnsi="Cambria Math"/>
+              </w:rPr>
+            </m:ctrlPr>
+          </m:dPr>
+          <m:e>
+            <m:r>
+              <w:rPr>
+                <w:rFonts w:ascii="Cambria Math" w:hAnsi="Cambria Math"/>
+              </w:rPr>
+              <m:t>m+n</m:t>
+            </m:r>
+          </m:e>
+        </m:d>
+      </m:oMath>
+      <w:r>
+        <w:t xml:space="preserve"> — We allocate a completely new linked list to store the resulting sum polynomial.</w:t>
+      </w:r>
+    </w:p>
+    <w:p>
+      <w:r>
+        <w:t>I have updated the code with clean, object-oriented principles, fixed the exponent assignment bug, and optimized the print renderer to handle negative terms gracefully.</w:t>
+      </w:r>
+    </w:p>
+    <w:p/>
     <w:sectPr>
       <w:pgSz w:w="11906" w:h="16838"/>
       <w:pgMar w:top="1440" w:right="1440" w:bottom="1440" w:left="1440" w:header="708" w:footer="708" w:gutter="0"/>
@@ -15830,6 +17006,155 @@
     </w:lvl>
   </w:abstractNum>
   <w:abstractNum w:abstractNumId="15" w15:restartNumberingAfterBreak="0">
+    <w:nsid w:val="221A0725"/>
+    <w:multiLevelType w:val="multilevel"/>
+    <w:tmpl w:val="98208994"/>
+    <w:lvl w:ilvl="0">
+      <w:start w:val="1"/>
+      <w:numFmt w:val="bullet"/>
+      <w:lvlText w:val=""/>
+      <w:lvlJc w:val="left"/>
+      <w:pPr>
+        <w:tabs>
+          <w:tab w:val="num" w:pos="720"/>
+        </w:tabs>
+        <w:ind w:left="720" w:hanging="360"/>
+      </w:pPr>
+      <w:rPr>
+        <w:rFonts w:ascii="Symbol" w:hAnsi="Symbol" w:hint="default"/>
+        <w:sz w:val="20"/>
+      </w:rPr>
+    </w:lvl>
+    <w:lvl w:ilvl="1" w:tentative="1">
+      <w:start w:val="1"/>
+      <w:numFmt w:val="bullet"/>
+      <w:lvlText w:val="o"/>
+      <w:lvlJc w:val="left"/>
+      <w:pPr>
+        <w:tabs>
+          <w:tab w:val="num" w:pos="1440"/>
+        </w:tabs>
+        <w:ind w:left="1440" w:hanging="360"/>
+      </w:pPr>
+      <w:rPr>
+        <w:rFonts w:ascii="Courier New" w:hAnsi="Courier New" w:hint="default"/>
+        <w:sz w:val="20"/>
+      </w:rPr>
+    </w:lvl>
+    <w:lvl w:ilvl="2" w:tentative="1">
+      <w:start w:val="1"/>
+      <w:numFmt w:val="bullet"/>
+      <w:lvlText w:val=""/>
+      <w:lvlJc w:val="left"/>
+      <w:pPr>
+        <w:tabs>
+          <w:tab w:val="num" w:pos="2160"/>
+        </w:tabs>
+        <w:ind w:left="2160" w:hanging="360"/>
+      </w:pPr>
+      <w:rPr>
+        <w:rFonts w:ascii="Wingdings" w:hAnsi="Wingdings" w:hint="default"/>
+        <w:sz w:val="20"/>
+      </w:rPr>
+    </w:lvl>
+    <w:lvl w:ilvl="3" w:tentative="1">
+      <w:start w:val="1"/>
+      <w:numFmt w:val="bullet"/>
+      <w:lvlText w:val=""/>
+      <w:lvlJc w:val="left"/>
+      <w:pPr>
+        <w:tabs>
+          <w:tab w:val="num" w:pos="2880"/>
+        </w:tabs>
+        <w:ind w:left="2880" w:hanging="360"/>
+      </w:pPr>
+      <w:rPr>
+        <w:rFonts w:ascii="Wingdings" w:hAnsi="Wingdings" w:hint="default"/>
+        <w:sz w:val="20"/>
+      </w:rPr>
+    </w:lvl>
+    <w:lvl w:ilvl="4" w:tentative="1">
+      <w:start w:val="1"/>
+      <w:numFmt w:val="bullet"/>
+      <w:lvlText w:val=""/>
+      <w:lvlJc w:val="left"/>
+      <w:pPr>
+        <w:tabs>
+          <w:tab w:val="num" w:pos="3600"/>
+        </w:tabs>
+        <w:ind w:left="3600" w:hanging="360"/>
+      </w:pPr>
+      <w:rPr>
+        <w:rFonts w:ascii="Wingdings" w:hAnsi="Wingdings" w:hint="default"/>
+        <w:sz w:val="20"/>
+      </w:rPr>
+    </w:lvl>
+    <w:lvl w:ilvl="5" w:tentative="1">
+      <w:start w:val="1"/>
+      <w:numFmt w:val="bullet"/>
+      <w:lvlText w:val=""/>
+      <w:lvlJc w:val="left"/>
+      <w:pPr>
+        <w:tabs>
+          <w:tab w:val="num" w:pos="4320"/>
+        </w:tabs>
+        <w:ind w:left="4320" w:hanging="360"/>
+      </w:pPr>
+      <w:rPr>
+        <w:rFonts w:ascii="Wingdings" w:hAnsi="Wingdings" w:hint="default"/>
+        <w:sz w:val="20"/>
+      </w:rPr>
+    </w:lvl>
+    <w:lvl w:ilvl="6" w:tentative="1">
+      <w:start w:val="1"/>
+      <w:numFmt w:val="bullet"/>
+      <w:lvlText w:val=""/>
+      <w:lvlJc w:val="left"/>
+      <w:pPr>
+        <w:tabs>
+          <w:tab w:val="num" w:pos="5040"/>
+        </w:tabs>
+        <w:ind w:left="5040" w:hanging="360"/>
+      </w:pPr>
+      <w:rPr>
+        <w:rFonts w:ascii="Wingdings" w:hAnsi="Wingdings" w:hint="default"/>
+        <w:sz w:val="20"/>
+      </w:rPr>
+    </w:lvl>
+    <w:lvl w:ilvl="7" w:tentative="1">
+      <w:start w:val="1"/>
+      <w:numFmt w:val="bullet"/>
+      <w:lvlText w:val=""/>
+      <w:lvlJc w:val="left"/>
+      <w:pPr>
+        <w:tabs>
+          <w:tab w:val="num" w:pos="5760"/>
+        </w:tabs>
+        <w:ind w:left="5760" w:hanging="360"/>
+      </w:pPr>
+      <w:rPr>
+        <w:rFonts w:ascii="Wingdings" w:hAnsi="Wingdings" w:hint="default"/>
+        <w:sz w:val="20"/>
+      </w:rPr>
+    </w:lvl>
+    <w:lvl w:ilvl="8" w:tentative="1">
+      <w:start w:val="1"/>
+      <w:numFmt w:val="bullet"/>
+      <w:lvlText w:val=""/>
+      <w:lvlJc w:val="left"/>
+      <w:pPr>
+        <w:tabs>
+          <w:tab w:val="num" w:pos="6480"/>
+        </w:tabs>
+        <w:ind w:left="6480" w:hanging="360"/>
+      </w:pPr>
+      <w:rPr>
+        <w:rFonts w:ascii="Wingdings" w:hAnsi="Wingdings" w:hint="default"/>
+        <w:sz w:val="20"/>
+      </w:rPr>
+    </w:lvl>
+  </w:abstractNum>
+  <w:abstractNum w:abstractNumId="16" w15:restartNumberingAfterBreak="0">
     <w:nsid w:val="236D56D3"/>
     <w:multiLevelType w:val="multilevel"/>
     <w:tmpl w:val="4DD68EF2"/>
@@ -15946,7 +17271,7 @@
       </w:pPr>
     </w:lvl>
   </w:abstractNum>
-  <w:abstractNum w:abstractNumId="16" w15:restartNumberingAfterBreak="0">
+  <w:abstractNum w:abstractNumId="17" w15:restartNumberingAfterBreak="0">
     <w:nsid w:val="24370749"/>
     <w:multiLevelType w:val="multilevel"/>
     <w:tmpl w:val="3CACE358"/>
@@ -16091,7 +17416,7 @@
       </w:rPr>
     </w:lvl>
   </w:abstractNum>
-  <w:abstractNum w:abstractNumId="17" w15:restartNumberingAfterBreak="0">
+  <w:abstractNum w:abstractNumId="18" w15:restartNumberingAfterBreak="0">
     <w:nsid w:val="26BE79BE"/>
     <w:multiLevelType w:val="multilevel"/>
     <w:tmpl w:val="64184666"/>
@@ -16204,7 +17529,7 @@
       </w:pPr>
     </w:lvl>
   </w:abstractNum>
-  <w:abstractNum w:abstractNumId="18" w15:restartNumberingAfterBreak="0">
+  <w:abstractNum w:abstractNumId="19" w15:restartNumberingAfterBreak="0">
     <w:nsid w:val="29084D0B"/>
     <w:multiLevelType w:val="multilevel"/>
     <w:tmpl w:val="A4167C9E"/>
@@ -16353,7 +17678,7 @@
       </w:rPr>
     </w:lvl>
   </w:abstractNum>
-  <w:abstractNum w:abstractNumId="19" w15:restartNumberingAfterBreak="0">
+  <w:abstractNum w:abstractNumId="20" w15:restartNumberingAfterBreak="0">
     <w:nsid w:val="29E14798"/>
     <w:multiLevelType w:val="multilevel"/>
     <w:tmpl w:val="9C5E49A8"/>
@@ -16502,7 +17827,7 @@
       </w:rPr>
     </w:lvl>
   </w:abstractNum>
-  <w:abstractNum w:abstractNumId="20" w15:restartNumberingAfterBreak="0">
+  <w:abstractNum w:abstractNumId="21" w15:restartNumberingAfterBreak="0">
     <w:nsid w:val="29E90EA7"/>
     <w:multiLevelType w:val="multilevel"/>
     <w:tmpl w:val="94B8D8AE"/>
@@ -16651,7 +17976,7 @@
       </w:rPr>
     </w:lvl>
   </w:abstractNum>
-  <w:abstractNum w:abstractNumId="21" w15:restartNumberingAfterBreak="0">
+  <w:abstractNum w:abstractNumId="22" w15:restartNumberingAfterBreak="0">
     <w:nsid w:val="2AA83398"/>
     <w:multiLevelType w:val="multilevel"/>
     <w:tmpl w:val="1DC8F2AA"/>
@@ -16800,7 +18125,7 @@
       </w:rPr>
     </w:lvl>
   </w:abstractNum>
-  <w:abstractNum w:abstractNumId="22" w15:restartNumberingAfterBreak="0">
+  <w:abstractNum w:abstractNumId="23" w15:restartNumberingAfterBreak="0">
     <w:nsid w:val="2BFE76B6"/>
     <w:multiLevelType w:val="multilevel"/>
     <w:tmpl w:val="CE46D2C6"/>
@@ -16949,7 +18274,7 @@
       </w:rPr>
     </w:lvl>
   </w:abstractNum>
-  <w:abstractNum w:abstractNumId="23" w15:restartNumberingAfterBreak="0">
+  <w:abstractNum w:abstractNumId="24" w15:restartNumberingAfterBreak="0">
     <w:nsid w:val="2C9A4D0B"/>
     <w:multiLevelType w:val="multilevel"/>
     <w:tmpl w:val="BD96BE0A"/>
@@ -17098,7 +18423,7 @@
       </w:rPr>
     </w:lvl>
   </w:abstractNum>
-  <w:abstractNum w:abstractNumId="24" w15:restartNumberingAfterBreak="0">
+  <w:abstractNum w:abstractNumId="25" w15:restartNumberingAfterBreak="0">
     <w:nsid w:val="2CBC5CE5"/>
     <w:multiLevelType w:val="multilevel"/>
     <w:tmpl w:val="31529FC2"/>
@@ -17247,7 +18572,7 @@
       </w:rPr>
     </w:lvl>
   </w:abstractNum>
-  <w:abstractNum w:abstractNumId="25" w15:restartNumberingAfterBreak="0">
+  <w:abstractNum w:abstractNumId="26" w15:restartNumberingAfterBreak="0">
     <w:nsid w:val="345C66C8"/>
     <w:multiLevelType w:val="multilevel"/>
     <w:tmpl w:val="8188E51A"/>
@@ -17360,7 +18685,7 @@
       </w:pPr>
     </w:lvl>
   </w:abstractNum>
-  <w:abstractNum w:abstractNumId="26" w15:restartNumberingAfterBreak="0">
+  <w:abstractNum w:abstractNumId="27" w15:restartNumberingAfterBreak="0">
     <w:nsid w:val="3A114C4F"/>
     <w:multiLevelType w:val="multilevel"/>
     <w:tmpl w:val="81E6B68C"/>
@@ -17509,7 +18834,7 @@
       </w:rPr>
     </w:lvl>
   </w:abstractNum>
-  <w:abstractNum w:abstractNumId="27" w15:restartNumberingAfterBreak="0">
+  <w:abstractNum w:abstractNumId="28" w15:restartNumberingAfterBreak="0">
     <w:nsid w:val="3B932CA4"/>
     <w:multiLevelType w:val="multilevel"/>
     <w:tmpl w:val="A738BF8C"/>
@@ -17658,7 +18983,7 @@
       </w:rPr>
     </w:lvl>
   </w:abstractNum>
-  <w:abstractNum w:abstractNumId="28" w15:restartNumberingAfterBreak="0">
+  <w:abstractNum w:abstractNumId="29" w15:restartNumberingAfterBreak="0">
     <w:nsid w:val="3C0E1CE2"/>
     <w:multiLevelType w:val="multilevel"/>
     <w:tmpl w:val="8806DA92"/>
@@ -17771,7 +19096,7 @@
       </w:pPr>
     </w:lvl>
   </w:abstractNum>
-  <w:abstractNum w:abstractNumId="29" w15:restartNumberingAfterBreak="0">
+  <w:abstractNum w:abstractNumId="30" w15:restartNumberingAfterBreak="0">
     <w:nsid w:val="3C6076E1"/>
     <w:multiLevelType w:val="multilevel"/>
     <w:tmpl w:val="E1D0AC82"/>
@@ -17920,7 +19245,7 @@
       </w:rPr>
     </w:lvl>
   </w:abstractNum>
-  <w:abstractNum w:abstractNumId="30" w15:restartNumberingAfterBreak="0">
+  <w:abstractNum w:abstractNumId="31" w15:restartNumberingAfterBreak="0">
     <w:nsid w:val="3D0C3A45"/>
     <w:multiLevelType w:val="multilevel"/>
     <w:tmpl w:val="763A24E4"/>
@@ -18069,7 +19394,7 @@
       </w:rPr>
     </w:lvl>
   </w:abstractNum>
-  <w:abstractNum w:abstractNumId="31" w15:restartNumberingAfterBreak="0">
+  <w:abstractNum w:abstractNumId="32" w15:restartNumberingAfterBreak="0">
     <w:nsid w:val="3EEC227F"/>
     <w:multiLevelType w:val="multilevel"/>
     <w:tmpl w:val="4CA848FC"/>
@@ -18182,7 +19507,7 @@
       </w:pPr>
     </w:lvl>
   </w:abstractNum>
-  <w:abstractNum w:abstractNumId="32" w15:restartNumberingAfterBreak="0">
+  <w:abstractNum w:abstractNumId="33" w15:restartNumberingAfterBreak="0">
     <w:nsid w:val="3F2B214C"/>
     <w:multiLevelType w:val="multilevel"/>
     <w:tmpl w:val="328ECCF4"/>
@@ -18331,7 +19656,7 @@
       </w:rPr>
     </w:lvl>
   </w:abstractNum>
-  <w:abstractNum w:abstractNumId="33" w15:restartNumberingAfterBreak="0">
+  <w:abstractNum w:abstractNumId="34" w15:restartNumberingAfterBreak="0">
     <w:nsid w:val="40A237AD"/>
     <w:multiLevelType w:val="multilevel"/>
     <w:tmpl w:val="55DC3488"/>
@@ -18480,7 +19805,7 @@
       </w:rPr>
     </w:lvl>
   </w:abstractNum>
-  <w:abstractNum w:abstractNumId="34" w15:restartNumberingAfterBreak="0">
+  <w:abstractNum w:abstractNumId="35" w15:restartNumberingAfterBreak="0">
     <w:nsid w:val="41370EF9"/>
     <w:multiLevelType w:val="multilevel"/>
     <w:tmpl w:val="18B2A5E4"/>
@@ -18629,7 +19954,7 @@
       </w:rPr>
     </w:lvl>
   </w:abstractNum>
-  <w:abstractNum w:abstractNumId="35" w15:restartNumberingAfterBreak="0">
+  <w:abstractNum w:abstractNumId="36" w15:restartNumberingAfterBreak="0">
     <w:nsid w:val="41616AB2"/>
     <w:multiLevelType w:val="multilevel"/>
     <w:tmpl w:val="D9B0C98C"/>
@@ -18778,7 +20103,7 @@
       </w:rPr>
     </w:lvl>
   </w:abstractNum>
-  <w:abstractNum w:abstractNumId="36" w15:restartNumberingAfterBreak="0">
+  <w:abstractNum w:abstractNumId="37" w15:restartNumberingAfterBreak="0">
     <w:nsid w:val="453F47A0"/>
     <w:multiLevelType w:val="multilevel"/>
     <w:tmpl w:val="1E947550"/>
@@ -18927,7 +20252,7 @@
       </w:rPr>
     </w:lvl>
   </w:abstractNum>
-  <w:abstractNum w:abstractNumId="37" w15:restartNumberingAfterBreak="0">
+  <w:abstractNum w:abstractNumId="38" w15:restartNumberingAfterBreak="0">
     <w:nsid w:val="49371508"/>
     <w:multiLevelType w:val="multilevel"/>
     <w:tmpl w:val="0186BE9E"/>
@@ -19076,7 +20401,7 @@
       </w:rPr>
     </w:lvl>
   </w:abstractNum>
-  <w:abstractNum w:abstractNumId="38" w15:restartNumberingAfterBreak="0">
+  <w:abstractNum w:abstractNumId="39" w15:restartNumberingAfterBreak="0">
     <w:nsid w:val="4DBA2F3E"/>
     <w:multiLevelType w:val="multilevel"/>
     <w:tmpl w:val="314697D6"/>
@@ -19225,7 +20550,7 @@
       </w:rPr>
     </w:lvl>
   </w:abstractNum>
-  <w:abstractNum w:abstractNumId="39" w15:restartNumberingAfterBreak="0">
+  <w:abstractNum w:abstractNumId="40" w15:restartNumberingAfterBreak="0">
     <w:nsid w:val="4E111884"/>
     <w:multiLevelType w:val="multilevel"/>
     <w:tmpl w:val="8AB27A18"/>
@@ -19338,7 +20663,7 @@
       </w:pPr>
     </w:lvl>
   </w:abstractNum>
-  <w:abstractNum w:abstractNumId="40" w15:restartNumberingAfterBreak="0">
+  <w:abstractNum w:abstractNumId="41" w15:restartNumberingAfterBreak="0">
     <w:nsid w:val="4F541E4E"/>
     <w:multiLevelType w:val="multilevel"/>
     <w:tmpl w:val="A6126970"/>
@@ -19487,7 +20812,7 @@
       </w:rPr>
     </w:lvl>
   </w:abstractNum>
-  <w:abstractNum w:abstractNumId="41" w15:restartNumberingAfterBreak="0">
+  <w:abstractNum w:abstractNumId="42" w15:restartNumberingAfterBreak="0">
     <w:nsid w:val="507A2F7E"/>
     <w:multiLevelType w:val="multilevel"/>
     <w:tmpl w:val="79D2FCCA"/>
@@ -19636,7 +20961,7 @@
       </w:rPr>
     </w:lvl>
   </w:abstractNum>
-  <w:abstractNum w:abstractNumId="42" w15:restartNumberingAfterBreak="0">
+  <w:abstractNum w:abstractNumId="43" w15:restartNumberingAfterBreak="0">
     <w:nsid w:val="51ED42FA"/>
     <w:multiLevelType w:val="multilevel"/>
     <w:tmpl w:val="54B060BC"/>
@@ -19785,7 +21110,7 @@
       </w:rPr>
     </w:lvl>
   </w:abstractNum>
-  <w:abstractNum w:abstractNumId="43" w15:restartNumberingAfterBreak="0">
+  <w:abstractNum w:abstractNumId="44" w15:restartNumberingAfterBreak="0">
     <w:nsid w:val="525F52A9"/>
     <w:multiLevelType w:val="multilevel"/>
     <w:tmpl w:val="B39E6D0A"/>
@@ -19934,7 +21259,7 @@
       </w:rPr>
     </w:lvl>
   </w:abstractNum>
-  <w:abstractNum w:abstractNumId="44" w15:restartNumberingAfterBreak="0">
+  <w:abstractNum w:abstractNumId="45" w15:restartNumberingAfterBreak="0">
     <w:nsid w:val="57B90FFA"/>
     <w:multiLevelType w:val="multilevel"/>
     <w:tmpl w:val="5FA84584"/>
@@ -20083,7 +21408,7 @@
       </w:rPr>
     </w:lvl>
   </w:abstractNum>
-  <w:abstractNum w:abstractNumId="45" w15:restartNumberingAfterBreak="0">
+  <w:abstractNum w:abstractNumId="46" w15:restartNumberingAfterBreak="0">
     <w:nsid w:val="58417512"/>
     <w:multiLevelType w:val="multilevel"/>
     <w:tmpl w:val="E5C8CF3C"/>
@@ -20232,7 +21557,7 @@
       </w:rPr>
     </w:lvl>
   </w:abstractNum>
-  <w:abstractNum w:abstractNumId="46" w15:restartNumberingAfterBreak="0">
+  <w:abstractNum w:abstractNumId="47" w15:restartNumberingAfterBreak="0">
     <w:nsid w:val="58451099"/>
     <w:multiLevelType w:val="multilevel"/>
     <w:tmpl w:val="D86AE340"/>
@@ -20381,7 +21706,7 @@
       </w:rPr>
     </w:lvl>
   </w:abstractNum>
-  <w:abstractNum w:abstractNumId="47" w15:restartNumberingAfterBreak="0">
+  <w:abstractNum w:abstractNumId="48" w15:restartNumberingAfterBreak="0">
     <w:nsid w:val="58BC5C46"/>
     <w:multiLevelType w:val="multilevel"/>
     <w:tmpl w:val="65249C42"/>
@@ -20530,7 +21855,7 @@
       </w:rPr>
     </w:lvl>
   </w:abstractNum>
-  <w:abstractNum w:abstractNumId="48" w15:restartNumberingAfterBreak="0">
+  <w:abstractNum w:abstractNumId="49" w15:restartNumberingAfterBreak="0">
     <w:nsid w:val="59D92615"/>
     <w:multiLevelType w:val="multilevel"/>
     <w:tmpl w:val="60D8A904"/>
@@ -20679,7 +22004,7 @@
       </w:rPr>
     </w:lvl>
   </w:abstractNum>
-  <w:abstractNum w:abstractNumId="49" w15:restartNumberingAfterBreak="0">
+  <w:abstractNum w:abstractNumId="50" w15:restartNumberingAfterBreak="0">
     <w:nsid w:val="5CDB77C7"/>
     <w:multiLevelType w:val="multilevel"/>
     <w:tmpl w:val="D21C076A"/>
@@ -20828,7 +22153,7 @@
       </w:rPr>
     </w:lvl>
   </w:abstractNum>
-  <w:abstractNum w:abstractNumId="50" w15:restartNumberingAfterBreak="0">
+  <w:abstractNum w:abstractNumId="51" w15:restartNumberingAfterBreak="0">
     <w:nsid w:val="5F435564"/>
     <w:multiLevelType w:val="multilevel"/>
     <w:tmpl w:val="32403E32"/>
@@ -20977,7 +22302,124 @@
       </w:rPr>
     </w:lvl>
   </w:abstractNum>
-  <w:abstractNum w:abstractNumId="51" w15:restartNumberingAfterBreak="0">
+  <w:abstractNum w:abstractNumId="52" w15:restartNumberingAfterBreak="0">
+    <w:nsid w:val="61B17E98"/>
+    <w:multiLevelType w:val="multilevel"/>
+    <w:tmpl w:val="B27488CE"/>
+    <w:lvl w:ilvl="0">
+      <w:start w:val="1"/>
+      <w:numFmt w:val="decimal"/>
+      <w:lvlText w:val="%1."/>
+      <w:lvlJc w:val="left"/>
+      <w:pPr>
+        <w:tabs>
+          <w:tab w:val="num" w:pos="720"/>
+        </w:tabs>
+        <w:ind w:left="720" w:hanging="360"/>
+      </w:pPr>
+    </w:lvl>
+    <w:lvl w:ilvl="1">
+      <w:start w:val="1"/>
+      <w:numFmt w:val="bullet"/>
+      <w:lvlText w:val="o"/>
+      <w:lvlJc w:val="left"/>
+      <w:pPr>
+        <w:tabs>
+          <w:tab w:val="num" w:pos="1440"/>
+        </w:tabs>
+        <w:ind w:left="1440" w:hanging="360"/>
+      </w:pPr>
+      <w:rPr>
+        <w:rFonts w:ascii="Courier New" w:hAnsi="Courier New" w:hint="default"/>
+        <w:sz w:val="20"/>
+      </w:rPr>
+    </w:lvl>
+    <w:lvl w:ilvl="2" w:tentative="1">
+      <w:start w:val="1"/>
+      <w:numFmt w:val="decimal"/>
+      <w:lvlText w:val="%3."/>
+      <w:lvlJc w:val="left"/>
+      <w:pPr>
+        <w:tabs>
+          <w:tab w:val="num" w:pos="2160"/>
+        </w:tabs>
+        <w:ind w:left="2160" w:hanging="360"/>
+      </w:pPr>
+    </w:lvl>
+    <w:lvl w:ilvl="3" w:tentative="1">
+      <w:start w:val="1"/>
+      <w:numFmt w:val="decimal"/>
+      <w:lvlText w:val="%4."/>
+      <w:lvlJc w:val="left"/>
+      <w:pPr>
+        <w:tabs>
+          <w:tab w:val="num" w:pos="2880"/>
+        </w:tabs>
+        <w:ind w:left="2880" w:hanging="360"/>
+      </w:pPr>
+    </w:lvl>
+    <w:lvl w:ilvl="4" w:tentative="1">
+      <w:start w:val="1"/>
+      <w:numFmt w:val="decimal"/>
+      <w:lvlText w:val="%5."/>
+      <w:lvlJc w:val="left"/>
+      <w:pPr>
+        <w:tabs>
+          <w:tab w:val="num" w:pos="3600"/>
+        </w:tabs>
+        <w:ind w:left="3600" w:hanging="360"/>
+      </w:pPr>
+    </w:lvl>
+    <w:lvl w:ilvl="5" w:tentative="1">
+      <w:start w:val="1"/>
+      <w:numFmt w:val="decimal"/>
+      <w:lvlText w:val="%6."/>
+      <w:lvlJc w:val="left"/>
+      <w:pPr>
+        <w:tabs>
+          <w:tab w:val="num" w:pos="4320"/>
+        </w:tabs>
+        <w:ind w:left="4320" w:hanging="360"/>
+      </w:pPr>
+    </w:lvl>
+    <w:lvl w:ilvl="6" w:tentative="1">
+      <w:start w:val="1"/>
+      <w:numFmt w:val="decimal"/>
+      <w:lvlText w:val="%7."/>
+      <w:lvlJc w:val="left"/>
+      <w:pPr>
+        <w:tabs>
+          <w:tab w:val="num" w:pos="5040"/>
+        </w:tabs>
+        <w:ind w:left="5040" w:hanging="360"/>
+      </w:pPr>
+    </w:lvl>
+    <w:lvl w:ilvl="7" w:tentative="1">
+      <w:start w:val="1"/>
+      <w:numFmt w:val="decimal"/>
+      <w:lvlText w:val="%8."/>
+      <w:lvlJc w:val="left"/>
+      <w:pPr>
+        <w:tabs>
+          <w:tab w:val="num" w:pos="5760"/>
+        </w:tabs>
+        <w:ind w:left="5760" w:hanging="360"/>
+      </w:pPr>
+    </w:lvl>
+    <w:lvl w:ilvl="8" w:tentative="1">
+      <w:start w:val="1"/>
+      <w:numFmt w:val="decimal"/>
+      <w:lvlText w:val="%9."/>
+      <w:lvlJc w:val="left"/>
+      <w:pPr>
+        <w:tabs>
+          <w:tab w:val="num" w:pos="6480"/>
+        </w:tabs>
+        <w:ind w:left="6480" w:hanging="360"/>
+      </w:pPr>
+    </w:lvl>
+  </w:abstractNum>
+  <w:abstractNum w:abstractNumId="53" w15:restartNumberingAfterBreak="0">
     <w:nsid w:val="649918D0"/>
     <w:multiLevelType w:val="multilevel"/>
     <w:tmpl w:val="397EE5AC"/>
@@ -21126,7 +22568,7 @@
       </w:rPr>
     </w:lvl>
   </w:abstractNum>
-  <w:abstractNum w:abstractNumId="52" w15:restartNumberingAfterBreak="0">
+  <w:abstractNum w:abstractNumId="54" w15:restartNumberingAfterBreak="0">
     <w:nsid w:val="6A3B1CA4"/>
     <w:multiLevelType w:val="multilevel"/>
     <w:tmpl w:val="E9F4EDD0"/>
@@ -21275,7 +22717,7 @@
       </w:rPr>
     </w:lvl>
   </w:abstractNum>
-  <w:abstractNum w:abstractNumId="53" w15:restartNumberingAfterBreak="0">
+  <w:abstractNum w:abstractNumId="55" w15:restartNumberingAfterBreak="0">
     <w:nsid w:val="715348CA"/>
     <w:multiLevelType w:val="multilevel"/>
     <w:tmpl w:val="50288884"/>
@@ -21388,7 +22830,7 @@
       </w:pPr>
     </w:lvl>
   </w:abstractNum>
-  <w:abstractNum w:abstractNumId="54" w15:restartNumberingAfterBreak="0">
+  <w:abstractNum w:abstractNumId="56" w15:restartNumberingAfterBreak="0">
     <w:nsid w:val="74635820"/>
     <w:multiLevelType w:val="multilevel"/>
     <w:tmpl w:val="391AF558"/>
@@ -21537,7 +22979,7 @@
       </w:rPr>
     </w:lvl>
   </w:abstractNum>
-  <w:abstractNum w:abstractNumId="55" w15:restartNumberingAfterBreak="0">
+  <w:abstractNum w:abstractNumId="57" w15:restartNumberingAfterBreak="0">
     <w:nsid w:val="76C12912"/>
     <w:multiLevelType w:val="multilevel"/>
     <w:tmpl w:val="B4221CA8"/>
@@ -21650,7 +23092,7 @@
       </w:pPr>
     </w:lvl>
   </w:abstractNum>
-  <w:abstractNum w:abstractNumId="56" w15:restartNumberingAfterBreak="0">
+  <w:abstractNum w:abstractNumId="58" w15:restartNumberingAfterBreak="0">
     <w:nsid w:val="789010C3"/>
     <w:multiLevelType w:val="multilevel"/>
     <w:tmpl w:val="53D0E026"/>
@@ -21799,7 +23241,7 @@
       </w:rPr>
     </w:lvl>
   </w:abstractNum>
-  <w:abstractNum w:abstractNumId="57" w15:restartNumberingAfterBreak="0">
+  <w:abstractNum w:abstractNumId="59" w15:restartNumberingAfterBreak="0">
     <w:nsid w:val="78BC0BDF"/>
     <w:multiLevelType w:val="multilevel"/>
     <w:tmpl w:val="41467532"/>
@@ -21948,7 +23390,7 @@
       </w:rPr>
     </w:lvl>
   </w:abstractNum>
-  <w:abstractNum w:abstractNumId="58" w15:restartNumberingAfterBreak="0">
+  <w:abstractNum w:abstractNumId="60" w15:restartNumberingAfterBreak="0">
     <w:nsid w:val="7B3163D6"/>
     <w:multiLevelType w:val="multilevel"/>
     <w:tmpl w:val="8BA84750"/>
@@ -22097,7 +23539,7 @@
       </w:rPr>
     </w:lvl>
   </w:abstractNum>
-  <w:abstractNum w:abstractNumId="59" w15:restartNumberingAfterBreak="0">
+  <w:abstractNum w:abstractNumId="61" w15:restartNumberingAfterBreak="0">
     <w:nsid w:val="7D404196"/>
     <w:multiLevelType w:val="multilevel"/>
     <w:tmpl w:val="97704CE2"/>
@@ -22247,46 +23689,46 @@
     </w:lvl>
   </w:abstractNum>
   <w:num w:numId="1" w16cid:durableId="696584190">
-    <w:abstractNumId w:val="31"/>
+    <w:abstractNumId w:val="32"/>
   </w:num>
   <w:num w:numId="2" w16cid:durableId="1747259762">
     <w:abstractNumId w:val="9"/>
   </w:num>
   <w:num w:numId="3" w16cid:durableId="1691179610">
-    <w:abstractNumId w:val="53"/>
+    <w:abstractNumId w:val="55"/>
   </w:num>
   <w:num w:numId="4" w16cid:durableId="2025091158">
-    <w:abstractNumId w:val="45"/>
+    <w:abstractNumId w:val="46"/>
   </w:num>
   <w:num w:numId="5" w16cid:durableId="468208416">
-    <w:abstractNumId w:val="17"/>
+    <w:abstractNumId w:val="18"/>
   </w:num>
   <w:num w:numId="6" w16cid:durableId="104664305">
-    <w:abstractNumId w:val="47"/>
+    <w:abstractNumId w:val="48"/>
   </w:num>
   <w:num w:numId="7" w16cid:durableId="15035671">
     <w:abstractNumId w:val="11"/>
   </w:num>
   <w:num w:numId="8" w16cid:durableId="655034754">
-    <w:abstractNumId w:val="44"/>
+    <w:abstractNumId w:val="45"/>
   </w:num>
   <w:num w:numId="9" w16cid:durableId="621419416">
-    <w:abstractNumId w:val="58"/>
+    <w:abstractNumId w:val="60"/>
   </w:num>
   <w:num w:numId="10" w16cid:durableId="1209219453">
-    <w:abstractNumId w:val="33"/>
+    <w:abstractNumId w:val="34"/>
   </w:num>
   <w:num w:numId="11" w16cid:durableId="1075200423">
     <w:abstractNumId w:val="12"/>
   </w:num>
   <w:num w:numId="12" w16cid:durableId="2013873678">
-    <w:abstractNumId w:val="36"/>
+    <w:abstractNumId w:val="37"/>
   </w:num>
   <w:num w:numId="13" w16cid:durableId="1133449715">
-    <w:abstractNumId w:val="41"/>
+    <w:abstractNumId w:val="42"/>
   </w:num>
   <w:num w:numId="14" w16cid:durableId="1348555731">
-    <w:abstractNumId w:val="48"/>
+    <w:abstractNumId w:val="49"/>
   </w:num>
   <w:num w:numId="15" w16cid:durableId="1389647130">
     <w:abstractNumId w:val="2"/>
@@ -22298,28 +23740,28 @@
     <w:abstractNumId w:val="10"/>
   </w:num>
   <w:num w:numId="18" w16cid:durableId="1536187369">
-    <w:abstractNumId w:val="28"/>
+    <w:abstractNumId w:val="29"/>
   </w:num>
   <w:num w:numId="19" w16cid:durableId="1141310079">
-    <w:abstractNumId w:val="42"/>
+    <w:abstractNumId w:val="43"/>
   </w:num>
   <w:num w:numId="20" w16cid:durableId="1813477048">
     <w:abstractNumId w:val="0"/>
   </w:num>
   <w:num w:numId="21" w16cid:durableId="543253394">
-    <w:abstractNumId w:val="37"/>
+    <w:abstractNumId w:val="38"/>
   </w:num>
   <w:num w:numId="22" w16cid:durableId="1226144208">
-    <w:abstractNumId w:val="22"/>
+    <w:abstractNumId w:val="23"/>
   </w:num>
   <w:num w:numId="23" w16cid:durableId="760297013">
-    <w:abstractNumId w:val="57"/>
+    <w:abstractNumId w:val="59"/>
   </w:num>
   <w:num w:numId="24" w16cid:durableId="1111126328">
-    <w:abstractNumId w:val="43"/>
+    <w:abstractNumId w:val="44"/>
   </w:num>
   <w:num w:numId="25" w16cid:durableId="1771581909">
-    <w:abstractNumId w:val="27"/>
+    <w:abstractNumId w:val="28"/>
   </w:num>
   <w:num w:numId="26" w16cid:durableId="1345085296">
     <w:abstractNumId w:val="1"/>
@@ -22328,25 +23770,25 @@
     <w:abstractNumId w:val="13"/>
   </w:num>
   <w:num w:numId="28" w16cid:durableId="982008169">
-    <w:abstractNumId w:val="29"/>
+    <w:abstractNumId w:val="30"/>
   </w:num>
   <w:num w:numId="29" w16cid:durableId="939066719">
-    <w:abstractNumId w:val="15"/>
+    <w:abstractNumId w:val="16"/>
   </w:num>
   <w:num w:numId="30" w16cid:durableId="876510830">
-    <w:abstractNumId w:val="39"/>
+    <w:abstractNumId w:val="40"/>
   </w:num>
   <w:num w:numId="31" w16cid:durableId="902106299">
-    <w:abstractNumId w:val="16"/>
+    <w:abstractNumId w:val="17"/>
   </w:num>
   <w:num w:numId="32" w16cid:durableId="1100490539">
     <w:abstractNumId w:val="3"/>
   </w:num>
   <w:num w:numId="33" w16cid:durableId="771121688">
-    <w:abstractNumId w:val="38"/>
+    <w:abstractNumId w:val="39"/>
   </w:num>
   <w:num w:numId="34" w16cid:durableId="1479685463">
-    <w:abstractNumId w:val="56"/>
+    <w:abstractNumId w:val="58"/>
   </w:num>
   <w:num w:numId="35" w16cid:durableId="134955994">
     <w:abstractNumId w:val="8"/>
@@ -22355,34 +23797,34 @@
     <w:abstractNumId w:val="4"/>
   </w:num>
   <w:num w:numId="37" w16cid:durableId="334914981">
-    <w:abstractNumId w:val="21"/>
+    <w:abstractNumId w:val="22"/>
   </w:num>
   <w:num w:numId="38" w16cid:durableId="1650011285">
-    <w:abstractNumId w:val="25"/>
+    <w:abstractNumId w:val="26"/>
   </w:num>
   <w:num w:numId="39" w16cid:durableId="1234654992">
-    <w:abstractNumId w:val="34"/>
+    <w:abstractNumId w:val="35"/>
   </w:num>
   <w:num w:numId="40" w16cid:durableId="1087116620">
-    <w:abstractNumId w:val="35"/>
+    <w:abstractNumId w:val="36"/>
   </w:num>
   <w:num w:numId="41" w16cid:durableId="1655406304">
-    <w:abstractNumId w:val="52"/>
+    <w:abstractNumId w:val="54"/>
   </w:num>
   <w:num w:numId="42" w16cid:durableId="596644524">
-    <w:abstractNumId w:val="18"/>
+    <w:abstractNumId w:val="19"/>
   </w:num>
   <w:num w:numId="43" w16cid:durableId="2003120680">
-    <w:abstractNumId w:val="54"/>
+    <w:abstractNumId w:val="56"/>
   </w:num>
   <w:num w:numId="44" w16cid:durableId="1243414595">
-    <w:abstractNumId w:val="46"/>
+    <w:abstractNumId w:val="47"/>
   </w:num>
   <w:num w:numId="45" w16cid:durableId="70087782">
-    <w:abstractNumId w:val="19"/>
+    <w:abstractNumId w:val="20"/>
   </w:num>
   <w:num w:numId="46" w16cid:durableId="1091659472">
-    <w:abstractNumId w:val="51"/>
+    <w:abstractNumId w:val="53"/>
   </w:num>
   <w:num w:numId="47" w16cid:durableId="1202404245">
     <w:abstractNumId w:val="7"/>
@@ -22391,42 +23833,48 @@
     <w:abstractNumId w:val="14"/>
   </w:num>
   <w:num w:numId="49" w16cid:durableId="1550337699">
-    <w:abstractNumId w:val="26"/>
+    <w:abstractNumId w:val="27"/>
   </w:num>
   <w:num w:numId="50" w16cid:durableId="172037436">
-    <w:abstractNumId w:val="20"/>
+    <w:abstractNumId w:val="21"/>
   </w:num>
   <w:num w:numId="51" w16cid:durableId="1191068728">
     <w:abstractNumId w:val="6"/>
   </w:num>
   <w:num w:numId="52" w16cid:durableId="1052116213">
+    <w:abstractNumId w:val="51"/>
+  </w:num>
+  <w:num w:numId="53" w16cid:durableId="861016012">
+    <w:abstractNumId w:val="41"/>
+  </w:num>
+  <w:num w:numId="54" w16cid:durableId="1091241527">
+    <w:abstractNumId w:val="31"/>
+  </w:num>
+  <w:num w:numId="55" w16cid:durableId="177276248">
+    <w:abstractNumId w:val="24"/>
+  </w:num>
+  <w:num w:numId="56" w16cid:durableId="650521810">
+    <w:abstractNumId w:val="25"/>
+  </w:num>
+  <w:num w:numId="57" w16cid:durableId="1886091548">
+    <w:abstractNumId w:val="57"/>
+  </w:num>
+  <w:num w:numId="58" w16cid:durableId="2111269196">
+    <w:abstractNumId w:val="61"/>
+  </w:num>
+  <w:num w:numId="59" w16cid:durableId="1442843145">
     <w:abstractNumId w:val="50"/>
   </w:num>
-  <w:num w:numId="53" w16cid:durableId="861016012">
-    <w:abstractNumId w:val="40"/>
+  <w:num w:numId="60" w16cid:durableId="496576927">
+    <w:abstractNumId w:val="33"/>
   </w:num>
-  <w:num w:numId="54" w16cid:durableId="1091241527">
-    <w:abstractNumId w:val="30"/>
+  <w:num w:numId="61" w16cid:durableId="1772966517">
+    <w:abstractNumId w:val="52"/>
   </w:num>
-  <w:num w:numId="55" w16cid:durableId="177276248">
-    <w:abstractNumId w:val="23"/>
+  <w:num w:numId="62" w16cid:durableId="967933486">
+    <w:abstractNumId w:val="15"/>
   </w:num>
-  <w:num w:numId="56" w16cid:durableId="650521810">
-    <w:abstractNumId w:val="24"/>
-  </w:num>
-  <w:num w:numId="57" w16cid:durableId="1886091548">
-    <w:abstractNumId w:val="55"/>
-  </w:num>
-  <w:num w:numId="58" w16cid:durableId="2111269196">
-    <w:abstractNumId w:val="59"/>
-  </w:num>
-  <w:num w:numId="59" w16cid:durableId="1442843145">
-    <w:abstractNumId w:val="49"/>
-  </w:num>
-  <w:num w:numId="60" w16cid:durableId="496576927">
-    <w:abstractNumId w:val="32"/>
-  </w:num>
-  <w:numIdMacAtCleanup w:val="51"/>
+  <w:numIdMacAtCleanup w:val="62"/>
 </w:numbering>
 </file>
 

</xml_diff>